<commit_message>
Document verified Zenodo DOI and finalize reviewed manuscripts
</commit_message>
<xml_diff>
--- a/outputs/reproducibility_v3/manuscript_en.docx
+++ b/outputs/reproducibility_v3/manuscript_en.docx
@@ -3183,7 +3183,18 @@
         </w:r>
       </w:hyperlink>
       <w:r>
-        <w:t xml:space="preserve">; [VERSION_SPECIFIC_ZENODO_DOI]; analysis commit </w:t>
+        <w:t xml:space="preserve">; </w:t>
+      </w:r>
+      <w:hyperlink r:id="rId34">
+        <w:r>
+          <w:rPr>
+            <w:color w:val="000000"/>
+          </w:rPr>
+          <w:t>version DOI 10.5281/zenodo.22705840</w:t>
+        </w:r>
+      </w:hyperlink>
+      <w:r>
+        <w:t xml:space="preserve">; analysis commit </w:t>
       </w:r>
       <w:r>
         <w:t>00067af9ab495f79385403141e06471b079afed6</w:t>
@@ -3697,7 +3708,7 @@
                     <pic:cNvPicPr/>
                   </pic:nvPicPr>
                   <pic:blipFill>
-                    <a:blip r:embed="rId34"/>
+                    <a:blip r:embed="rId35"/>
                     <a:stretch>
                       <a:fillRect/>
                     </a:stretch>
@@ -3749,7 +3760,7 @@
                     <pic:cNvPicPr/>
                   </pic:nvPicPr>
                   <pic:blipFill>
-                    <a:blip r:embed="rId35"/>
+                    <a:blip r:embed="rId36"/>
                     <a:stretch>
                       <a:fillRect/>
                     </a:stretch>
@@ -3801,7 +3812,7 @@
                     <pic:cNvPicPr/>
                   </pic:nvPicPr>
                   <pic:blipFill>
-                    <a:blip r:embed="rId36"/>
+                    <a:blip r:embed="rId37"/>
                     <a:stretch>
                       <a:fillRect/>
                     </a:stretch>
@@ -3853,7 +3864,7 @@
                     <pic:cNvPicPr/>
                   </pic:nvPicPr>
                   <pic:blipFill>
-                    <a:blip r:embed="rId37"/>
+                    <a:blip r:embed="rId38"/>
                     <a:stretch>
                       <a:fillRect/>
                     </a:stretch>
@@ -3905,7 +3916,7 @@
                     <pic:cNvPicPr/>
                   </pic:nvPicPr>
                   <pic:blipFill>
-                    <a:blip r:embed="rId38"/>
+                    <a:blip r:embed="rId39"/>
                     <a:stretch>
                       <a:fillRect/>
                     </a:stretch>

</xml_diff>